<commit_message>
change URL to outworldz
</commit_message>
<xml_diff>
--- a/Docs/Story Grid.docx
+++ b/Docs/Story Grid.docx
@@ -56,7 +56,7 @@
           <w:sz w:val="24"/>
           <w:szCs w:val="24"/>
         </w:rPr>
-        <w:t xml:space="preserve">The human landing in the Outworldz starts a war between the Dragons,  Skeletons  and the Pirates and Harpies.  </w:t>
+        <w:t xml:space="preserve">The human landing in the Outworldz starts a war between the Dragons,  Skeletons  and the VIkings and Harpies.  </w:t>
       </w:r>
     </w:p>
     <w:p>
@@ -276,6 +276,9 @@
           <w:p>
             <w:pPr>
               <w:pStyle w:val="Heading2"/>
+              <w:rPr>
+                <w:rFonts w:ascii="Times New Roman" w:hAnsi="Times New Roman" w:cs="Times New Roman"/>
+              </w:rPr>
             </w:pPr>
           </w:p>
         </w:tc>
@@ -2859,7 +2862,6 @@
       <w:outlineLvl w:val="1"/>
     </w:pPr>
     <w:rPr>
-      <w:rFonts w:cstheme="minorBidi"/>
       <w:b/>
       <w:bCs/>
       <w:sz w:val="24"/>
@@ -2936,7 +2938,6 @@
       <w:spacing w:before="100" w:beforeAutospacing="1" w:after="100" w:afterAutospacing="1" w:line="240" w:lineRule="auto"/>
     </w:pPr>
     <w:rPr>
-      <w:rFonts w:cstheme="minorBidi"/>
       <w:sz w:val="24"/>
       <w:szCs w:val="24"/>
     </w:rPr>

</xml_diff>